<commit_message>
Regenerate deliverables for the SME QMS feedback: guides, IMS templates, feedback response, decks, checklist, sample documents
Co-Authored-By: Claude Opus 5.5 <noreply@anthropic.com>
Claude-Session: https://claude.ai/code/session_018jWCkFayhGXSEUDh9BTEcJ
</commit_message>
<xml_diff>
--- a/DynamicMS/deliverables/DynamicMS_Installation_Guide.docx
+++ b/DynamicMS/deliverables/DynamicMS_Installation_Guide.docx
@@ -268,7 +268,7 @@
             </w:rPr>
             <w:fldChar w:fldCharType="separate"/>
           </w:r>
-          <w:hyperlink w:anchor="__RefHeading___Toc9680_1839608832">
+          <w:hyperlink w:anchor="__RefHeading___Toc9251_2124901813">
             <w:r>
               <w:rPr>
                 <w:webHidden/>
@@ -289,7 +289,7 @@
             </w:tabs>
             <w:rPr/>
           </w:pPr>
-          <w:hyperlink w:anchor="__RefHeading___Toc9682_1839608832">
+          <w:hyperlink w:anchor="__RefHeading___Toc9253_2124901813">
             <w:r>
               <w:rPr>
                 <w:webHidden/>
@@ -310,7 +310,7 @@
             </w:tabs>
             <w:rPr/>
           </w:pPr>
-          <w:hyperlink w:anchor="__RefHeading___Toc9684_1839608832">
+          <w:hyperlink w:anchor="__RefHeading___Toc9255_2124901813">
             <w:r>
               <w:rPr>
                 <w:webHidden/>
@@ -331,7 +331,7 @@
             </w:tabs>
             <w:rPr/>
           </w:pPr>
-          <w:hyperlink w:anchor="__RefHeading___Toc9686_1839608832">
+          <w:hyperlink w:anchor="__RefHeading___Toc9257_2124901813">
             <w:r>
               <w:rPr>
                 <w:webHidden/>
@@ -352,7 +352,7 @@
             </w:tabs>
             <w:rPr/>
           </w:pPr>
-          <w:hyperlink w:anchor="__RefHeading___Toc9688_1839608832">
+          <w:hyperlink w:anchor="__RefHeading___Toc9259_2124901813">
             <w:r>
               <w:rPr>
                 <w:webHidden/>
@@ -373,7 +373,7 @@
             </w:tabs>
             <w:rPr/>
           </w:pPr>
-          <w:hyperlink w:anchor="__RefHeading___Toc9690_1839608832">
+          <w:hyperlink w:anchor="__RefHeading___Toc9261_2124901813">
             <w:r>
               <w:rPr>
                 <w:webHidden/>
@@ -394,7 +394,7 @@
             </w:tabs>
             <w:rPr/>
           </w:pPr>
-          <w:hyperlink w:anchor="__RefHeading___Toc9692_1839608832">
+          <w:hyperlink w:anchor="__RefHeading___Toc9263_2124901813">
             <w:r>
               <w:rPr>
                 <w:webHidden/>
@@ -415,7 +415,7 @@
             </w:tabs>
             <w:rPr/>
           </w:pPr>
-          <w:hyperlink w:anchor="__RefHeading___Toc9694_1839608832">
+          <w:hyperlink w:anchor="__RefHeading___Toc9265_2124901813">
             <w:r>
               <w:rPr>
                 <w:webHidden/>
@@ -436,7 +436,7 @@
             </w:tabs>
             <w:rPr/>
           </w:pPr>
-          <w:hyperlink w:anchor="__RefHeading___Toc9696_1839608832">
+          <w:hyperlink w:anchor="__RefHeading___Toc9267_2124901813">
             <w:r>
               <w:rPr>
                 <w:webHidden/>
@@ -457,7 +457,7 @@
             </w:tabs>
             <w:rPr/>
           </w:pPr>
-          <w:hyperlink w:anchor="__RefHeading___Toc9698_1839608832">
+          <w:hyperlink w:anchor="__RefHeading___Toc9269_2124901813">
             <w:r>
               <w:rPr>
                 <w:webHidden/>
@@ -478,7 +478,7 @@
             </w:tabs>
             <w:rPr/>
           </w:pPr>
-          <w:hyperlink w:anchor="__RefHeading___Toc9700_1839608832">
+          <w:hyperlink w:anchor="__RefHeading___Toc9271_2124901813">
             <w:r>
               <w:rPr>
                 <w:webHidden/>
@@ -499,7 +499,7 @@
             </w:tabs>
             <w:rPr/>
           </w:pPr>
-          <w:hyperlink w:anchor="__RefHeading___Toc9702_1839608832">
+          <w:hyperlink w:anchor="__RefHeading___Toc9273_2124901813">
             <w:r>
               <w:rPr>
                 <w:webHidden/>
@@ -520,13 +520,13 @@
             </w:tabs>
             <w:rPr/>
           </w:pPr>
-          <w:hyperlink w:anchor="__RefHeading___Toc9704_1839608832">
+          <w:hyperlink w:anchor="__RefHeading___Toc9275_2124901813">
             <w:r>
               <w:rPr>
                 <w:webHidden/>
                 <w:rStyle w:val="IndexLink"/>
               </w:rPr>
-              <w:t>Automated tests</w:t>
+              <w:t>AI models (optional)</w:t>
               <w:tab/>
               <w:t>6</w:t>
             </w:r>
@@ -541,7 +541,49 @@
             </w:tabs>
             <w:rPr/>
           </w:pPr>
-          <w:hyperlink w:anchor="__RefHeading___Toc9706_1839608832">
+          <w:hyperlink w:anchor="__RefHeading___Toc9277_2124901813">
+            <w:r>
+              <w:rPr>
+                <w:webHidden/>
+                <w:rStyle w:val="IndexLink"/>
+              </w:rPr>
+              <w:t>Document layout and templates</w:t>
+              <w:tab/>
+              <w:t>6</w:t>
+            </w:r>
+          </w:hyperlink>
+        </w:p>
+        <w:p>
+          <w:pPr>
+            <w:pStyle w:val="TOC1"/>
+            <w:tabs>
+              <w:tab w:val="clear" w:pos="9746"/>
+              <w:tab w:val="right" w:pos="9745" w:leader="dot"/>
+            </w:tabs>
+            <w:rPr/>
+          </w:pPr>
+          <w:hyperlink w:anchor="__RefHeading___Toc9279_2124901813">
+            <w:r>
+              <w:rPr>
+                <w:webHidden/>
+                <w:rStyle w:val="IndexLink"/>
+              </w:rPr>
+              <w:t>Automated tests</w:t>
+              <w:tab/>
+              <w:t>7</w:t>
+            </w:r>
+          </w:hyperlink>
+        </w:p>
+        <w:p>
+          <w:pPr>
+            <w:pStyle w:val="TOC1"/>
+            <w:tabs>
+              <w:tab w:val="clear" w:pos="9746"/>
+              <w:tab w:val="right" w:pos="9745" w:leader="dot"/>
+            </w:tabs>
+            <w:rPr/>
+          </w:pPr>
+          <w:hyperlink w:anchor="__RefHeading___Toc9281_2124901813">
             <w:r>
               <w:rPr>
                 <w:webHidden/>
@@ -549,7 +591,7 @@
               </w:rPr>
               <w:t>Troubleshooting</w:t>
               <w:tab/>
-              <w:t>6</w:t>
+              <w:t>7</w:t>
             </w:r>
           </w:hyperlink>
           <w:r>
@@ -591,7 +633,7 @@
         <w:spacing w:before="0" w:after="160"/>
         <w:rPr/>
       </w:pPr>
-      <w:bookmarkStart w:id="0" w:name="__RefHeading___Toc9680_1839608832"/>
+      <w:bookmarkStart w:id="0" w:name="__RefHeading___Toc9251_2124901813"/>
       <w:bookmarkEnd w:id="0"/>
       <w:r>
         <w:rPr/>
@@ -904,7 +946,7 @@
         <w:pStyle w:val="Heading2"/>
         <w:rPr/>
       </w:pPr>
-      <w:bookmarkStart w:id="1" w:name="__RefHeading___Toc9682_1839608832"/>
+      <w:bookmarkStart w:id="1" w:name="__RefHeading___Toc9253_2124901813"/>
       <w:bookmarkEnd w:id="1"/>
       <w:r>
         <w:rPr/>
@@ -1412,7 +1454,7 @@
         <w:pStyle w:val="Heading1"/>
         <w:rPr/>
       </w:pPr>
-      <w:bookmarkStart w:id="2" w:name="__RefHeading___Toc9684_1839608832"/>
+      <w:bookmarkStart w:id="2" w:name="__RefHeading___Toc9255_2124901813"/>
       <w:bookmarkEnd w:id="2"/>
       <w:r>
         <w:rPr/>
@@ -1496,7 +1538,7 @@
         <w:pStyle w:val="Heading1"/>
         <w:rPr/>
       </w:pPr>
-      <w:bookmarkStart w:id="3" w:name="__RefHeading___Toc9686_1839608832"/>
+      <w:bookmarkStart w:id="3" w:name="__RefHeading___Toc9257_2124901813"/>
       <w:bookmarkEnd w:id="3"/>
       <w:r>
         <w:rPr/>
@@ -1508,7 +1550,7 @@
         <w:pStyle w:val="Heading2"/>
         <w:rPr/>
       </w:pPr>
-      <w:bookmarkStart w:id="4" w:name="__RefHeading___Toc9688_1839608832"/>
+      <w:bookmarkStart w:id="4" w:name="__RefHeading___Toc9259_2124901813"/>
       <w:bookmarkEnd w:id="4"/>
       <w:r>
         <w:rPr/>
@@ -1532,7 +1574,7 @@
         <w:pStyle w:val="Heading2"/>
         <w:rPr/>
       </w:pPr>
-      <w:bookmarkStart w:id="5" w:name="__RefHeading___Toc9690_1839608832"/>
+      <w:bookmarkStart w:id="5" w:name="__RefHeading___Toc9261_2124901813"/>
       <w:bookmarkEnd w:id="5"/>
       <w:r>
         <w:rPr/>
@@ -1809,7 +1851,7 @@
         <w:pStyle w:val="Heading2"/>
         <w:rPr/>
       </w:pPr>
-      <w:bookmarkStart w:id="6" w:name="__RefHeading___Toc9692_1839608832"/>
+      <w:bookmarkStart w:id="6" w:name="__RefHeading___Toc9263_2124901813"/>
       <w:bookmarkEnd w:id="6"/>
       <w:r>
         <w:rPr/>
@@ -1996,7 +2038,7 @@
         <w:pStyle w:val="Heading2"/>
         <w:rPr/>
       </w:pPr>
-      <w:bookmarkStart w:id="7" w:name="__RefHeading___Toc9694_1839608832"/>
+      <w:bookmarkStart w:id="7" w:name="__RefHeading___Toc9265_2124901813"/>
       <w:bookmarkEnd w:id="7"/>
       <w:r>
         <w:rPr/>
@@ -2643,7 +2685,7 @@
         <w:pStyle w:val="Heading1"/>
         <w:rPr/>
       </w:pPr>
-      <w:bookmarkStart w:id="8" w:name="__RefHeading___Toc9696_1839608832"/>
+      <w:bookmarkStart w:id="8" w:name="__RefHeading___Toc9267_2124901813"/>
       <w:bookmarkEnd w:id="8"/>
       <w:r>
         <w:rPr/>
@@ -3636,7 +3678,7 @@
         <w:pStyle w:val="Heading1"/>
         <w:rPr/>
       </w:pPr>
-      <w:bookmarkStart w:id="9" w:name="__RefHeading___Toc9698_1839608832"/>
+      <w:bookmarkStart w:id="9" w:name="__RefHeading___Toc9269_2124901813"/>
       <w:bookmarkEnd w:id="9"/>
       <w:r>
         <w:rPr/>
@@ -3927,7 +3969,7 @@
         <w:pStyle w:val="Heading1"/>
         <w:rPr/>
       </w:pPr>
-      <w:bookmarkStart w:id="10" w:name="__RefHeading___Toc9700_1839608832"/>
+      <w:bookmarkStart w:id="10" w:name="__RefHeading___Toc9271_2124901813"/>
       <w:bookmarkEnd w:id="10"/>
       <w:r>
         <w:rPr/>
@@ -4114,7 +4156,7 @@
         <w:pStyle w:val="Heading1"/>
         <w:rPr/>
       </w:pPr>
-      <w:bookmarkStart w:id="11" w:name="__RefHeading___Toc9702_1839608832"/>
+      <w:bookmarkStart w:id="11" w:name="__RefHeading___Toc9273_2124901813"/>
       <w:bookmarkEnd w:id="11"/>
       <w:r>
         <w:rPr/>
@@ -4350,8 +4392,128 @@
         <w:pStyle w:val="Heading1"/>
         <w:rPr/>
       </w:pPr>
-      <w:bookmarkStart w:id="12" w:name="__RefHeading___Toc9704_1839608832"/>
+      <w:bookmarkStart w:id="12" w:name="__RefHeading___Toc9275_2124901813"/>
       <w:bookmarkEnd w:id="12"/>
+      <w:r>
+        <w:rPr/>
+        <w:t>AI models (optional)</w:t>
+      </w:r>
+    </w:p>
+    <w:p>
+      <w:pPr>
+        <w:pStyle w:val="Normal"/>
+        <w:rPr/>
+      </w:pPr>
+      <w:r>
+        <w:rPr>
+          <w:i w:val="false"/>
+        </w:rPr>
+        <w:t>The AI use cases work without any external service: the built-in engine answers from the DynamicMS content and the organization data. To use a large language model instead, the tenant administrator opens Administration › AI models, chooses a standard provider and model (Anthropic Claude, OpenAI, Azure OpenAI, Google Gemini, Mistral) or a custom model with an OpenAI-compatible HTTPS endpoint, types the API key, selects Test the connection and enables it.</w:t>
+      </w:r>
+    </w:p>
+    <w:p>
+      <w:pPr>
+        <w:pStyle w:val="ListBullet"/>
+        <w:numPr>
+          <w:ilvl w:val="0"/>
+          <w:numId w:val="1"/>
+        </w:numPr>
+        <w:spacing w:before="0" w:after="40"/>
+        <w:contextualSpacing/>
+        <w:jc w:val="left"/>
+        <w:rPr/>
+      </w:pPr>
+      <w:r>
+        <w:rPr>
+          <w:b/>
+          <w:color w:val="3A3A3C"/>
+        </w:rPr>
+        <w:t xml:space="preserve">Keys. </w:t>
+      </w:r>
+      <w:r>
+        <w:rPr/>
+        <w:t>API keys are encrypted at rest (AES-256-GCM, key derived from JWT_SECRET) and never sent back to the browser. Changing JWT_SECRET makes stored keys unreadable: type them again.</w:t>
+      </w:r>
+    </w:p>
+    <w:p>
+      <w:pPr>
+        <w:pStyle w:val="ListBullet"/>
+        <w:numPr>
+          <w:ilvl w:val="0"/>
+          <w:numId w:val="1"/>
+        </w:numPr>
+        <w:spacing w:before="0" w:after="40"/>
+        <w:contextualSpacing/>
+        <w:jc w:val="left"/>
+        <w:rPr/>
+      </w:pPr>
+      <w:r>
+        <w:rPr>
+          <w:b/>
+          <w:color w:val="3A3A3C"/>
+        </w:rPr>
+        <w:t xml:space="preserve">Network. </w:t>
+      </w:r>
+      <w:r>
+        <w:rPr/>
+        <w:t>The server calls the provider from its own network: allow outbound HTTPS to the provider host (for example api.anthropic.com) in the firewall or proxy.</w:t>
+      </w:r>
+    </w:p>
+    <w:p>
+      <w:pPr>
+        <w:pStyle w:val="ListBullet"/>
+        <w:numPr>
+          <w:ilvl w:val="0"/>
+          <w:numId w:val="1"/>
+        </w:numPr>
+        <w:spacing w:before="0" w:after="40"/>
+        <w:contextualSpacing/>
+        <w:jc w:val="left"/>
+        <w:rPr/>
+      </w:pPr>
+      <w:r>
+        <w:rPr>
+          <w:b/>
+          <w:color w:val="3A3A3C"/>
+        </w:rPr>
+        <w:t xml:space="preserve">Fallback. </w:t>
+      </w:r>
+      <w:r>
+        <w:rPr/>
+        <w:t>If the provider does not answer within 30 seconds or returns an error, the built-in engine answers and the user sees a warning.</w:t>
+      </w:r>
+    </w:p>
+    <w:p>
+      <w:pPr>
+        <w:pStyle w:val="Heading1"/>
+        <w:rPr/>
+      </w:pPr>
+      <w:bookmarkStart w:id="13" w:name="__RefHeading___Toc9277_2124901813"/>
+      <w:bookmarkEnd w:id="13"/>
+      <w:r>
+        <w:rPr/>
+        <w:t>Document layout and templates</w:t>
+      </w:r>
+    </w:p>
+    <w:p>
+      <w:pPr>
+        <w:pStyle w:val="Normal"/>
+        <w:rPr/>
+      </w:pPr>
+      <w:r>
+        <w:rPr>
+          <w:i w:val="false"/>
+        </w:rPr>
+        <w:t>Generated documents (Word, PDF, Excel) use the layout of the organization: Records › Documents › Layout (logo image in PNG or JPEG up to 2 MB, colors, header and footer). Logos are stored in STORAGE_DIR. The 37 IMS templates are delivered with the application; organizations copy and adapt them in Records › Documents › Templates.</w:t>
+      </w:r>
+    </w:p>
+    <w:p>
+      <w:pPr>
+        <w:pStyle w:val="Heading1"/>
+        <w:rPr/>
+      </w:pPr>
+      <w:bookmarkStart w:id="14" w:name="__RefHeading___Toc9279_2124901813"/>
+      <w:bookmarkEnd w:id="14"/>
       <w:r>
         <w:rPr/>
         <w:t>Automated tests</w:t>
@@ -4366,7 +4528,7 @@
         <w:rPr>
           <w:i w:val="false"/>
         </w:rPr>
-        <w:t>In the server folder, npm test runs the API test suite on a copy of the seeded database: sign-in, full-run step completion and reopen, gate rules, cross-tenant isolation, RBAC, one-Accountable RACSI rule, owner-evaluator separation, report exports in three languages and four formats, AI suggestions, benchmarking, project creation modes, permission matrix, compliance disclosure and backups.</w:t>
+        <w:t>In the server folder, npm test runs the 12 API tests on a copy of the seeded database: sign-in, full-run step completion and reopen, gate rules, cross-tenant isolation, RBAC, one-Accountable RACSI rule, owner-evaluator separation, report exports in three languages and four formats, AI suggestions, benchmarking, project creation modes, permission matrix, compliance disclosure, backups, and the structured forms (record tables, actions from plans, SMART objectives, KPI from a step), document templates (generation, structure, versions, downloads, layout), RACSI per macro process and step, readiness checklist, AI model settings and group and organization creation.</w:t>
       </w:r>
     </w:p>
     <w:tbl>
@@ -4495,8 +4657,8 @@
         <w:pStyle w:val="Heading1"/>
         <w:rPr/>
       </w:pPr>
-      <w:bookmarkStart w:id="13" w:name="__RefHeading___Toc9706_1839608832"/>
-      <w:bookmarkEnd w:id="13"/>
+      <w:bookmarkStart w:id="15" w:name="__RefHeading___Toc9281_2124901813"/>
+      <w:bookmarkEnd w:id="15"/>
       <w:r>
         <w:rPr/>
         <w:t>Troubleshooting</w:t>

</xml_diff>

<commit_message>
Implement SRS 1.5 features and market-practice IMS documents
Global search, process design editor with versions and restore, OBS roles
linked to functions, AI prompt specification with versioned fields, audit
frequency and graded findings, finer-grained registers, procedures with
SIPOC, Go/No-Go and BPMN diagrams; revised templates and deliverables,
including the round 2 feedback response.

Co-Authored-By: Claude Opus 5.5 <noreply@anthropic.com>
Claude-Session: https://claude.ai/code/session_018jWCkFayhGXSEUDh9BTEcJ
</commit_message>
<xml_diff>
--- a/DynamicMS/deliverables/DynamicMS_Installation_Guide.docx
+++ b/DynamicMS/deliverables/DynamicMS_Installation_Guide.docx
@@ -268,7 +268,7 @@
             </w:rPr>
             <w:fldChar w:fldCharType="separate"/>
           </w:r>
-          <w:hyperlink w:anchor="__RefHeading___Toc9251_2124901813">
+          <w:hyperlink w:anchor="__RefHeading___Toc10808_1997311591">
             <w:r>
               <w:rPr>
                 <w:webHidden/>
@@ -289,7 +289,7 @@
             </w:tabs>
             <w:rPr/>
           </w:pPr>
-          <w:hyperlink w:anchor="__RefHeading___Toc9253_2124901813">
+          <w:hyperlink w:anchor="__RefHeading___Toc10810_1997311591">
             <w:r>
               <w:rPr>
                 <w:webHidden/>
@@ -310,7 +310,7 @@
             </w:tabs>
             <w:rPr/>
           </w:pPr>
-          <w:hyperlink w:anchor="__RefHeading___Toc9255_2124901813">
+          <w:hyperlink w:anchor="__RefHeading___Toc10812_1997311591">
             <w:r>
               <w:rPr>
                 <w:webHidden/>
@@ -331,7 +331,7 @@
             </w:tabs>
             <w:rPr/>
           </w:pPr>
-          <w:hyperlink w:anchor="__RefHeading___Toc9257_2124901813">
+          <w:hyperlink w:anchor="__RefHeading___Toc10814_1997311591">
             <w:r>
               <w:rPr>
                 <w:webHidden/>
@@ -352,7 +352,7 @@
             </w:tabs>
             <w:rPr/>
           </w:pPr>
-          <w:hyperlink w:anchor="__RefHeading___Toc9259_2124901813">
+          <w:hyperlink w:anchor="__RefHeading___Toc10816_1997311591">
             <w:r>
               <w:rPr>
                 <w:webHidden/>
@@ -373,7 +373,7 @@
             </w:tabs>
             <w:rPr/>
           </w:pPr>
-          <w:hyperlink w:anchor="__RefHeading___Toc9261_2124901813">
+          <w:hyperlink w:anchor="__RefHeading___Toc10818_1997311591">
             <w:r>
               <w:rPr>
                 <w:webHidden/>
@@ -394,7 +394,7 @@
             </w:tabs>
             <w:rPr/>
           </w:pPr>
-          <w:hyperlink w:anchor="__RefHeading___Toc9263_2124901813">
+          <w:hyperlink w:anchor="__RefHeading___Toc10820_1997311591">
             <w:r>
               <w:rPr>
                 <w:webHidden/>
@@ -415,7 +415,7 @@
             </w:tabs>
             <w:rPr/>
           </w:pPr>
-          <w:hyperlink w:anchor="__RefHeading___Toc9265_2124901813">
+          <w:hyperlink w:anchor="__RefHeading___Toc10822_1997311591">
             <w:r>
               <w:rPr>
                 <w:webHidden/>
@@ -436,7 +436,7 @@
             </w:tabs>
             <w:rPr/>
           </w:pPr>
-          <w:hyperlink w:anchor="__RefHeading___Toc9267_2124901813">
+          <w:hyperlink w:anchor="__RefHeading___Toc10824_1997311591">
             <w:r>
               <w:rPr>
                 <w:webHidden/>
@@ -457,7 +457,7 @@
             </w:tabs>
             <w:rPr/>
           </w:pPr>
-          <w:hyperlink w:anchor="__RefHeading___Toc9269_2124901813">
+          <w:hyperlink w:anchor="__RefHeading___Toc10826_1997311591">
             <w:r>
               <w:rPr>
                 <w:webHidden/>
@@ -478,7 +478,7 @@
             </w:tabs>
             <w:rPr/>
           </w:pPr>
-          <w:hyperlink w:anchor="__RefHeading___Toc9271_2124901813">
+          <w:hyperlink w:anchor="__RefHeading___Toc10828_1997311591">
             <w:r>
               <w:rPr>
                 <w:webHidden/>
@@ -499,7 +499,7 @@
             </w:tabs>
             <w:rPr/>
           </w:pPr>
-          <w:hyperlink w:anchor="__RefHeading___Toc9273_2124901813">
+          <w:hyperlink w:anchor="__RefHeading___Toc10830_1997311591">
             <w:r>
               <w:rPr>
                 <w:webHidden/>
@@ -520,7 +520,7 @@
             </w:tabs>
             <w:rPr/>
           </w:pPr>
-          <w:hyperlink w:anchor="__RefHeading___Toc9275_2124901813">
+          <w:hyperlink w:anchor="__RefHeading___Toc10832_1997311591">
             <w:r>
               <w:rPr>
                 <w:webHidden/>
@@ -541,7 +541,7 @@
             </w:tabs>
             <w:rPr/>
           </w:pPr>
-          <w:hyperlink w:anchor="__RefHeading___Toc9277_2124901813">
+          <w:hyperlink w:anchor="__RefHeading___Toc10834_1997311591">
             <w:r>
               <w:rPr>
                 <w:webHidden/>
@@ -562,7 +562,7 @@
             </w:tabs>
             <w:rPr/>
           </w:pPr>
-          <w:hyperlink w:anchor="__RefHeading___Toc9279_2124901813">
+          <w:hyperlink w:anchor="__RefHeading___Toc10836_1997311591">
             <w:r>
               <w:rPr>
                 <w:webHidden/>
@@ -583,7 +583,7 @@
             </w:tabs>
             <w:rPr/>
           </w:pPr>
-          <w:hyperlink w:anchor="__RefHeading___Toc9281_2124901813">
+          <w:hyperlink w:anchor="__RefHeading___Toc10838_1997311591">
             <w:r>
               <w:rPr>
                 <w:webHidden/>
@@ -633,7 +633,7 @@
         <w:spacing w:before="0" w:after="160"/>
         <w:rPr/>
       </w:pPr>
-      <w:bookmarkStart w:id="0" w:name="__RefHeading___Toc9251_2124901813"/>
+      <w:bookmarkStart w:id="0" w:name="__RefHeading___Toc10808_1997311591"/>
       <w:bookmarkEnd w:id="0"/>
       <w:r>
         <w:rPr/>
@@ -946,7 +946,7 @@
         <w:pStyle w:val="Heading2"/>
         <w:rPr/>
       </w:pPr>
-      <w:bookmarkStart w:id="1" w:name="__RefHeading___Toc9253_2124901813"/>
+      <w:bookmarkStart w:id="1" w:name="__RefHeading___Toc10810_1997311591"/>
       <w:bookmarkEnd w:id="1"/>
       <w:r>
         <w:rPr/>
@@ -1454,7 +1454,7 @@
         <w:pStyle w:val="Heading1"/>
         <w:rPr/>
       </w:pPr>
-      <w:bookmarkStart w:id="2" w:name="__RefHeading___Toc9255_2124901813"/>
+      <w:bookmarkStart w:id="2" w:name="__RefHeading___Toc10812_1997311591"/>
       <w:bookmarkEnd w:id="2"/>
       <w:r>
         <w:rPr/>
@@ -1538,7 +1538,7 @@
         <w:pStyle w:val="Heading1"/>
         <w:rPr/>
       </w:pPr>
-      <w:bookmarkStart w:id="3" w:name="__RefHeading___Toc9257_2124901813"/>
+      <w:bookmarkStart w:id="3" w:name="__RefHeading___Toc10814_1997311591"/>
       <w:bookmarkEnd w:id="3"/>
       <w:r>
         <w:rPr/>
@@ -1550,7 +1550,7 @@
         <w:pStyle w:val="Heading2"/>
         <w:rPr/>
       </w:pPr>
-      <w:bookmarkStart w:id="4" w:name="__RefHeading___Toc9259_2124901813"/>
+      <w:bookmarkStart w:id="4" w:name="__RefHeading___Toc10816_1997311591"/>
       <w:bookmarkEnd w:id="4"/>
       <w:r>
         <w:rPr/>
@@ -1574,7 +1574,7 @@
         <w:pStyle w:val="Heading2"/>
         <w:rPr/>
       </w:pPr>
-      <w:bookmarkStart w:id="5" w:name="__RefHeading___Toc9261_2124901813"/>
+      <w:bookmarkStart w:id="5" w:name="__RefHeading___Toc10818_1997311591"/>
       <w:bookmarkEnd w:id="5"/>
       <w:r>
         <w:rPr/>
@@ -1851,7 +1851,7 @@
         <w:pStyle w:val="Heading2"/>
         <w:rPr/>
       </w:pPr>
-      <w:bookmarkStart w:id="6" w:name="__RefHeading___Toc9263_2124901813"/>
+      <w:bookmarkStart w:id="6" w:name="__RefHeading___Toc10820_1997311591"/>
       <w:bookmarkEnd w:id="6"/>
       <w:r>
         <w:rPr/>
@@ -2038,7 +2038,7 @@
         <w:pStyle w:val="Heading2"/>
         <w:rPr/>
       </w:pPr>
-      <w:bookmarkStart w:id="7" w:name="__RefHeading___Toc9265_2124901813"/>
+      <w:bookmarkStart w:id="7" w:name="__RefHeading___Toc10822_1997311591"/>
       <w:bookmarkEnd w:id="7"/>
       <w:r>
         <w:rPr/>
@@ -2685,7 +2685,7 @@
         <w:pStyle w:val="Heading1"/>
         <w:rPr/>
       </w:pPr>
-      <w:bookmarkStart w:id="8" w:name="__RefHeading___Toc9267_2124901813"/>
+      <w:bookmarkStart w:id="8" w:name="__RefHeading___Toc10824_1997311591"/>
       <w:bookmarkEnd w:id="8"/>
       <w:r>
         <w:rPr/>
@@ -3678,7 +3678,7 @@
         <w:pStyle w:val="Heading1"/>
         <w:rPr/>
       </w:pPr>
-      <w:bookmarkStart w:id="9" w:name="__RefHeading___Toc9269_2124901813"/>
+      <w:bookmarkStart w:id="9" w:name="__RefHeading___Toc10826_1997311591"/>
       <w:bookmarkEnd w:id="9"/>
       <w:r>
         <w:rPr/>
@@ -3969,7 +3969,7 @@
         <w:pStyle w:val="Heading1"/>
         <w:rPr/>
       </w:pPr>
-      <w:bookmarkStart w:id="10" w:name="__RefHeading___Toc9271_2124901813"/>
+      <w:bookmarkStart w:id="10" w:name="__RefHeading___Toc10828_1997311591"/>
       <w:bookmarkEnd w:id="10"/>
       <w:r>
         <w:rPr/>
@@ -4156,7 +4156,7 @@
         <w:pStyle w:val="Heading1"/>
         <w:rPr/>
       </w:pPr>
-      <w:bookmarkStart w:id="11" w:name="__RefHeading___Toc9273_2124901813"/>
+      <w:bookmarkStart w:id="11" w:name="__RefHeading___Toc10830_1997311591"/>
       <w:bookmarkEnd w:id="11"/>
       <w:r>
         <w:rPr/>
@@ -4392,7 +4392,7 @@
         <w:pStyle w:val="Heading1"/>
         <w:rPr/>
       </w:pPr>
-      <w:bookmarkStart w:id="12" w:name="__RefHeading___Toc9275_2124901813"/>
+      <w:bookmarkStart w:id="12" w:name="__RefHeading___Toc10832_1997311591"/>
       <w:bookmarkEnd w:id="12"/>
       <w:r>
         <w:rPr/>
@@ -4488,7 +4488,7 @@
         <w:pStyle w:val="Heading1"/>
         <w:rPr/>
       </w:pPr>
-      <w:bookmarkStart w:id="13" w:name="__RefHeading___Toc9277_2124901813"/>
+      <w:bookmarkStart w:id="13" w:name="__RefHeading___Toc10834_1997311591"/>
       <w:bookmarkEnd w:id="13"/>
       <w:r>
         <w:rPr/>
@@ -4509,10 +4509,22 @@
     </w:p>
     <w:p>
       <w:pPr>
+        <w:pStyle w:val="Normal"/>
+        <w:rPr/>
+      </w:pPr>
+      <w:r>
+        <w:rPr>
+          <w:i w:val="false"/>
+        </w:rPr>
+        <w:t>Diagrams in generated documents (BPMN flows of procedures, process maps) are drawn by the server and converted to images with @resvg/resvg-wasm, a pure WebAssembly package installed by npm install: no native build tool, browser or system library is needed, on Windows, macOS or Linux.</w:t>
+      </w:r>
+    </w:p>
+    <w:p>
+      <w:pPr>
         <w:pStyle w:val="Heading1"/>
         <w:rPr/>
       </w:pPr>
-      <w:bookmarkStart w:id="14" w:name="__RefHeading___Toc9279_2124901813"/>
+      <w:bookmarkStart w:id="14" w:name="__RefHeading___Toc10836_1997311591"/>
       <w:bookmarkEnd w:id="14"/>
       <w:r>
         <w:rPr/>
@@ -4528,7 +4540,7 @@
         <w:rPr>
           <w:i w:val="false"/>
         </w:rPr>
-        <w:t>In the server folder, npm test runs the 12 API tests on a copy of the seeded database: sign-in, full-run step completion and reopen, gate rules, cross-tenant isolation, RBAC, one-Accountable RACSI rule, owner-evaluator separation, report exports in three languages and four formats, AI suggestions, benchmarking, project creation modes, permission matrix, compliance disclosure, backups, and the structured forms (record tables, actions from plans, SMART objectives, KPI from a step), document templates (generation, structure, versions, downloads, layout), RACSI per macro process and step, readiness checklist, AI model settings and group and organization creation.</w:t>
+        <w:t>In the server folder, npm test runs the 13 API tests on a copy of the seeded database: sign-in, full-run step completion and reopen, gate rules, cross-tenant isolation, RBAC, one-Accountable RACSI rule, owner-evaluator separation, report exports in three languages and four formats, AI suggestions, benchmarking, project creation modes, permission matrix, compliance disclosure, backups, and the structured forms (record tables, actions from plans, SMART objectives, KPI from a step), document templates (generation, structure, versions, downloads, layout), RACSI per macro process and step, readiness checklist, AI model settings and group and organization creation, global search, process design versions (edit, compare, restore), OBS roles and assignments, AI prompt specification (field versions and activation rule), audit frequency and graded findings.</w:t>
       </w:r>
     </w:p>
     <w:tbl>
@@ -4657,7 +4669,7 @@
         <w:pStyle w:val="Heading1"/>
         <w:rPr/>
       </w:pPr>
-      <w:bookmarkStart w:id="15" w:name="__RefHeading___Toc9281_2124901813"/>
+      <w:bookmarkStart w:id="15" w:name="__RefHeading___Toc10838_1997311591"/>
       <w:bookmarkEnd w:id="15"/>
       <w:r>
         <w:rPr/>

</xml_diff>

<commit_message>
Round 3: qualified step forms, needs linked to parties, header search
- Record tables: qualified column titles per step, lists with Custom,
  macro process pickers, large row editor with scrolling and a way back
- New needs and expectations form: a need mapped to several interested
  parties, entered manually, from the library or suggested by the AI
- Completing issue and party steps fills the registers; the context
  analysis shows parties, needs and the influence and interest grid
- Scrollable dialogs, search bar in the header, Functions and document
  templates in the menu, identifiers shown as ID (name)
- AI panel states which engine answered and why; built-in policy draft;
  accepted text goes to the final field
- Round 3 feedback response, guides, presentations and samples rebuilt

Co-Authored-By: Claude Opus 5.5 <noreply@anthropic.com>
Claude-Session: https://claude.ai/code/session_018jWCkFayhGXSEUDh9BTEcJ
</commit_message>
<xml_diff>
--- a/DynamicMS/deliverables/DynamicMS_Installation_Guide.docx
+++ b/DynamicMS/deliverables/DynamicMS_Installation_Guide.docx
@@ -268,7 +268,7 @@
             </w:rPr>
             <w:fldChar w:fldCharType="separate"/>
           </w:r>
-          <w:hyperlink w:anchor="__RefHeading___Toc10808_1997311591">
+          <w:hyperlink w:anchor="__RefHeading___Toc10758_3070331996">
             <w:r>
               <w:rPr>
                 <w:webHidden/>
@@ -289,7 +289,7 @@
             </w:tabs>
             <w:rPr/>
           </w:pPr>
-          <w:hyperlink w:anchor="__RefHeading___Toc10810_1997311591">
+          <w:hyperlink w:anchor="__RefHeading___Toc10760_3070331996">
             <w:r>
               <w:rPr>
                 <w:webHidden/>
@@ -310,7 +310,7 @@
             </w:tabs>
             <w:rPr/>
           </w:pPr>
-          <w:hyperlink w:anchor="__RefHeading___Toc10812_1997311591">
+          <w:hyperlink w:anchor="__RefHeading___Toc10762_3070331996">
             <w:r>
               <w:rPr>
                 <w:webHidden/>
@@ -331,7 +331,7 @@
             </w:tabs>
             <w:rPr/>
           </w:pPr>
-          <w:hyperlink w:anchor="__RefHeading___Toc10814_1997311591">
+          <w:hyperlink w:anchor="__RefHeading___Toc10764_3070331996">
             <w:r>
               <w:rPr>
                 <w:webHidden/>
@@ -352,7 +352,7 @@
             </w:tabs>
             <w:rPr/>
           </w:pPr>
-          <w:hyperlink w:anchor="__RefHeading___Toc10816_1997311591">
+          <w:hyperlink w:anchor="__RefHeading___Toc10766_3070331996">
             <w:r>
               <w:rPr>
                 <w:webHidden/>
@@ -373,7 +373,7 @@
             </w:tabs>
             <w:rPr/>
           </w:pPr>
-          <w:hyperlink w:anchor="__RefHeading___Toc10818_1997311591">
+          <w:hyperlink w:anchor="__RefHeading___Toc10768_3070331996">
             <w:r>
               <w:rPr>
                 <w:webHidden/>
@@ -394,7 +394,7 @@
             </w:tabs>
             <w:rPr/>
           </w:pPr>
-          <w:hyperlink w:anchor="__RefHeading___Toc10820_1997311591">
+          <w:hyperlink w:anchor="__RefHeading___Toc10770_3070331996">
             <w:r>
               <w:rPr>
                 <w:webHidden/>
@@ -415,7 +415,7 @@
             </w:tabs>
             <w:rPr/>
           </w:pPr>
-          <w:hyperlink w:anchor="__RefHeading___Toc10822_1997311591">
+          <w:hyperlink w:anchor="__RefHeading___Toc10772_3070331996">
             <w:r>
               <w:rPr>
                 <w:webHidden/>
@@ -436,7 +436,7 @@
             </w:tabs>
             <w:rPr/>
           </w:pPr>
-          <w:hyperlink w:anchor="__RefHeading___Toc10824_1997311591">
+          <w:hyperlink w:anchor="__RefHeading___Toc10774_3070331996">
             <w:r>
               <w:rPr>
                 <w:webHidden/>
@@ -457,7 +457,7 @@
             </w:tabs>
             <w:rPr/>
           </w:pPr>
-          <w:hyperlink w:anchor="__RefHeading___Toc10826_1997311591">
+          <w:hyperlink w:anchor="__RefHeading___Toc10776_3070331996">
             <w:r>
               <w:rPr>
                 <w:webHidden/>
@@ -478,7 +478,7 @@
             </w:tabs>
             <w:rPr/>
           </w:pPr>
-          <w:hyperlink w:anchor="__RefHeading___Toc10828_1997311591">
+          <w:hyperlink w:anchor="__RefHeading___Toc10778_3070331996">
             <w:r>
               <w:rPr>
                 <w:webHidden/>
@@ -499,7 +499,7 @@
             </w:tabs>
             <w:rPr/>
           </w:pPr>
-          <w:hyperlink w:anchor="__RefHeading___Toc10830_1997311591">
+          <w:hyperlink w:anchor="__RefHeading___Toc10780_3070331996">
             <w:r>
               <w:rPr>
                 <w:webHidden/>
@@ -520,7 +520,7 @@
             </w:tabs>
             <w:rPr/>
           </w:pPr>
-          <w:hyperlink w:anchor="__RefHeading___Toc10832_1997311591">
+          <w:hyperlink w:anchor="__RefHeading___Toc10782_3070331996">
             <w:r>
               <w:rPr>
                 <w:webHidden/>
@@ -541,7 +541,7 @@
             </w:tabs>
             <w:rPr/>
           </w:pPr>
-          <w:hyperlink w:anchor="__RefHeading___Toc10834_1997311591">
+          <w:hyperlink w:anchor="__RefHeading___Toc10784_3070331996">
             <w:r>
               <w:rPr>
                 <w:webHidden/>
@@ -562,7 +562,7 @@
             </w:tabs>
             <w:rPr/>
           </w:pPr>
-          <w:hyperlink w:anchor="__RefHeading___Toc10836_1997311591">
+          <w:hyperlink w:anchor="__RefHeading___Toc10786_3070331996">
             <w:r>
               <w:rPr>
                 <w:webHidden/>
@@ -583,7 +583,7 @@
             </w:tabs>
             <w:rPr/>
           </w:pPr>
-          <w:hyperlink w:anchor="__RefHeading___Toc10838_1997311591">
+          <w:hyperlink w:anchor="__RefHeading___Toc10788_3070331996">
             <w:r>
               <w:rPr>
                 <w:webHidden/>
@@ -633,7 +633,7 @@
         <w:spacing w:before="0" w:after="160"/>
         <w:rPr/>
       </w:pPr>
-      <w:bookmarkStart w:id="0" w:name="__RefHeading___Toc10808_1997311591"/>
+      <w:bookmarkStart w:id="0" w:name="__RefHeading___Toc10758_3070331996"/>
       <w:bookmarkEnd w:id="0"/>
       <w:r>
         <w:rPr/>
@@ -946,7 +946,7 @@
         <w:pStyle w:val="Heading2"/>
         <w:rPr/>
       </w:pPr>
-      <w:bookmarkStart w:id="1" w:name="__RefHeading___Toc10810_1997311591"/>
+      <w:bookmarkStart w:id="1" w:name="__RefHeading___Toc10760_3070331996"/>
       <w:bookmarkEnd w:id="1"/>
       <w:r>
         <w:rPr/>
@@ -1454,7 +1454,7 @@
         <w:pStyle w:val="Heading1"/>
         <w:rPr/>
       </w:pPr>
-      <w:bookmarkStart w:id="2" w:name="__RefHeading___Toc10812_1997311591"/>
+      <w:bookmarkStart w:id="2" w:name="__RefHeading___Toc10762_3070331996"/>
       <w:bookmarkEnd w:id="2"/>
       <w:r>
         <w:rPr/>
@@ -1538,7 +1538,7 @@
         <w:pStyle w:val="Heading1"/>
         <w:rPr/>
       </w:pPr>
-      <w:bookmarkStart w:id="3" w:name="__RefHeading___Toc10814_1997311591"/>
+      <w:bookmarkStart w:id="3" w:name="__RefHeading___Toc10764_3070331996"/>
       <w:bookmarkEnd w:id="3"/>
       <w:r>
         <w:rPr/>
@@ -1550,7 +1550,7 @@
         <w:pStyle w:val="Heading2"/>
         <w:rPr/>
       </w:pPr>
-      <w:bookmarkStart w:id="4" w:name="__RefHeading___Toc10816_1997311591"/>
+      <w:bookmarkStart w:id="4" w:name="__RefHeading___Toc10766_3070331996"/>
       <w:bookmarkEnd w:id="4"/>
       <w:r>
         <w:rPr/>
@@ -1574,7 +1574,7 @@
         <w:pStyle w:val="Heading2"/>
         <w:rPr/>
       </w:pPr>
-      <w:bookmarkStart w:id="5" w:name="__RefHeading___Toc10818_1997311591"/>
+      <w:bookmarkStart w:id="5" w:name="__RefHeading___Toc10768_3070331996"/>
       <w:bookmarkEnd w:id="5"/>
       <w:r>
         <w:rPr/>
@@ -1851,7 +1851,7 @@
         <w:pStyle w:val="Heading2"/>
         <w:rPr/>
       </w:pPr>
-      <w:bookmarkStart w:id="6" w:name="__RefHeading___Toc10820_1997311591"/>
+      <w:bookmarkStart w:id="6" w:name="__RefHeading___Toc10770_3070331996"/>
       <w:bookmarkEnd w:id="6"/>
       <w:r>
         <w:rPr/>
@@ -2038,7 +2038,7 @@
         <w:pStyle w:val="Heading2"/>
         <w:rPr/>
       </w:pPr>
-      <w:bookmarkStart w:id="7" w:name="__RefHeading___Toc10822_1997311591"/>
+      <w:bookmarkStart w:id="7" w:name="__RefHeading___Toc10772_3070331996"/>
       <w:bookmarkEnd w:id="7"/>
       <w:r>
         <w:rPr/>
@@ -2685,7 +2685,7 @@
         <w:pStyle w:val="Heading1"/>
         <w:rPr/>
       </w:pPr>
-      <w:bookmarkStart w:id="8" w:name="__RefHeading___Toc10824_1997311591"/>
+      <w:bookmarkStart w:id="8" w:name="__RefHeading___Toc10774_3070331996"/>
       <w:bookmarkEnd w:id="8"/>
       <w:r>
         <w:rPr/>
@@ -3678,7 +3678,7 @@
         <w:pStyle w:val="Heading1"/>
         <w:rPr/>
       </w:pPr>
-      <w:bookmarkStart w:id="9" w:name="__RefHeading___Toc10826_1997311591"/>
+      <w:bookmarkStart w:id="9" w:name="__RefHeading___Toc10776_3070331996"/>
       <w:bookmarkEnd w:id="9"/>
       <w:r>
         <w:rPr/>
@@ -3969,7 +3969,7 @@
         <w:pStyle w:val="Heading1"/>
         <w:rPr/>
       </w:pPr>
-      <w:bookmarkStart w:id="10" w:name="__RefHeading___Toc10828_1997311591"/>
+      <w:bookmarkStart w:id="10" w:name="__RefHeading___Toc10778_3070331996"/>
       <w:bookmarkEnd w:id="10"/>
       <w:r>
         <w:rPr/>
@@ -4156,7 +4156,7 @@
         <w:pStyle w:val="Heading1"/>
         <w:rPr/>
       </w:pPr>
-      <w:bookmarkStart w:id="11" w:name="__RefHeading___Toc10830_1997311591"/>
+      <w:bookmarkStart w:id="11" w:name="__RefHeading___Toc10780_3070331996"/>
       <w:bookmarkEnd w:id="11"/>
       <w:r>
         <w:rPr/>
@@ -4392,7 +4392,7 @@
         <w:pStyle w:val="Heading1"/>
         <w:rPr/>
       </w:pPr>
-      <w:bookmarkStart w:id="12" w:name="__RefHeading___Toc10832_1997311591"/>
+      <w:bookmarkStart w:id="12" w:name="__RefHeading___Toc10782_3070331996"/>
       <w:bookmarkEnd w:id="12"/>
       <w:r>
         <w:rPr/>
@@ -4488,7 +4488,7 @@
         <w:pStyle w:val="Heading1"/>
         <w:rPr/>
       </w:pPr>
-      <w:bookmarkStart w:id="13" w:name="__RefHeading___Toc10834_1997311591"/>
+      <w:bookmarkStart w:id="13" w:name="__RefHeading___Toc10784_3070331996"/>
       <w:bookmarkEnd w:id="13"/>
       <w:r>
         <w:rPr/>
@@ -4524,7 +4524,7 @@
         <w:pStyle w:val="Heading1"/>
         <w:rPr/>
       </w:pPr>
-      <w:bookmarkStart w:id="14" w:name="__RefHeading___Toc10836_1997311591"/>
+      <w:bookmarkStart w:id="14" w:name="__RefHeading___Toc10786_3070331996"/>
       <w:bookmarkEnd w:id="14"/>
       <w:r>
         <w:rPr/>
@@ -4540,7 +4540,7 @@
         <w:rPr>
           <w:i w:val="false"/>
         </w:rPr>
-        <w:t>In the server folder, npm test runs the 13 API tests on a copy of the seeded database: sign-in, full-run step completion and reopen, gate rules, cross-tenant isolation, RBAC, one-Accountable RACSI rule, owner-evaluator separation, report exports in three languages and four formats, AI suggestions, benchmarking, project creation modes, permission matrix, compliance disclosure, backups, and the structured forms (record tables, actions from plans, SMART objectives, KPI from a step), document templates (generation, structure, versions, downloads, layout), RACSI per macro process and step, readiness checklist, AI model settings and group and organization creation, global search, process design versions (edit, compare, restore), OBS roles and assignments, AI prompt specification (field versions and activation rule), audit frequency and graded findings.</w:t>
+        <w:t>In the server folder, npm test runs the 14 API tests on a copy of the seeded database: sign-in, full-run step completion and reopen, gate rules, cross-tenant isolation, RBAC, one-Accountable RACSI rule, owner-evaluator separation, report exports in three languages and four formats, AI suggestions, benchmarking, project creation modes, permission matrix, compliance disclosure, backups, and the structured forms (record tables, actions from plans, SMART objectives, KPI from a step), document templates (generation, structure, versions, downloads, layout), RACSI per macro process and step, readiness checklist, AI model settings and group and organization creation, global search, process design versions (edit, compare, restore), OBS roles and assignments, AI prompt specification (field versions and activation rule), audit frequency and graded findings, and the step forms of round 3 (qualified columns, lists with Custom, macro process pickers, needs linked to several interested parties with library and AI suggestion, registers filled on completion, context analysis document).</w:t>
       </w:r>
     </w:p>
     <w:tbl>
@@ -4669,7 +4669,7 @@
         <w:pStyle w:val="Heading1"/>
         <w:rPr/>
       </w:pPr>
-      <w:bookmarkStart w:id="15" w:name="__RefHeading___Toc10838_1997311591"/>
+      <w:bookmarkStart w:id="15" w:name="__RefHeading___Toc10788_3070331996"/>
       <w:bookmarkEnd w:id="15"/>
       <w:r>
         <w:rPr/>

</xml_diff>